<commit_message>
Add CMP412 socket demos and CMP414 OS assignments
Add simple socket client/server time example for CMP412 (client_assignment.py, server_assignment.py) and reorganize existing client/server scripts into client_to_server and server_to_multiple_client folders. Add CMP414 assignments: producer-consumer (producerandconsumer.c), synchronization (synchronization.c) and scheduling (scheduling.c/.cpp) along with compiled binaries and auxiliary executables. Also add course documents and images. These changes organize code samples and include working implementations demonstrating sockets, semaphores, and mutex-based synchronization for teaching labs.
</commit_message>
<xml_diff>
--- a/TMC 411/TOTAL MAN CONCEPT Q26.docx
+++ b/TMC 411/TOTAL MAN CONCEPT Q26.docx
@@ -1,11 +1,12 @@
 
 <file path=word/document.xml><?xml version="1.0" encoding="utf-8"?>
-<w:document xmlns:wpc="http://schemas.microsoft.com/office/word/2010/wordprocessingCanvas" xmlns:cx="http://schemas.microsoft.com/office/drawing/2014/chartex" xmlns:cx1="http://schemas.microsoft.com/office/drawing/2015/9/8/chartex" xmlns:cx2="http://schemas.microsoft.com/office/drawing/2015/10/21/chartex" xmlns:cx3="http://schemas.microsoft.com/office/drawing/2016/5/9/chartex" xmlns:cx4="http://schemas.microsoft.com/office/drawing/2016/5/10/chartex" xmlns:cx5="http://schemas.microsoft.com/office/drawing/2016/5/11/chartex" xmlns:cx6="http://schemas.microsoft.com/office/drawing/2016/5/12/chartex" xmlns:cx7="http://schemas.microsoft.com/office/drawing/2016/5/13/chartex" xmlns:cx8="http://schemas.microsoft.com/office/drawing/2016/5/14/chartex" xmlns:mc="http://schemas.openxmlformats.org/markup-compatibility/2006" xmlns:aink="http://schemas.microsoft.com/office/drawing/2016/ink" xmlns:am3d="http://schemas.microsoft.com/office/drawing/2017/model3d" xmlns:o="urn:schemas-microsoft-com:office:office" xmlns:r="http://schemas.openxmlformats.org/officeDocument/2006/relationships" xmlns:m="http://schemas.openxmlformats.org/officeDocument/2006/math" xmlns:v="urn:schemas-microsoft-com:vml" xmlns:wp14="http://schemas.microsoft.com/office/word/2010/wordprocessingDrawing" xmlns:wp="http://schemas.openxmlformats.org/drawingml/2006/wordprocessingDrawing" xmlns:w10="urn:schemas-microsoft-com:office:word" xmlns:w="http://schemas.openxmlformats.org/wordprocessingml/2006/main" xmlns:w14="http://schemas.microsoft.com/office/word/2010/wordml" xmlns:w15="http://schemas.microsoft.com/office/word/2012/wordml" xmlns:w16cid="http://schemas.microsoft.com/office/word/2016/wordml/cid" xmlns:w16se="http://schemas.microsoft.com/office/word/2015/wordml/symex" xmlns:wpg="http://schemas.microsoft.com/office/word/2010/wordprocessingGroup" xmlns:wpi="http://schemas.microsoft.com/office/word/2010/wordprocessingInk" xmlns:wne="http://schemas.microsoft.com/office/word/2006/wordml" xmlns:wps="http://schemas.microsoft.com/office/word/2010/wordprocessingShape" mc:Ignorable="w14 w15 w16se w16cid wp14">
+<w:document xmlns:wpc="http://schemas.microsoft.com/office/word/2010/wordprocessingCanvas" xmlns:cx="http://schemas.microsoft.com/office/drawing/2014/chartex" xmlns:cx1="http://schemas.microsoft.com/office/drawing/2015/9/8/chartex" xmlns:cx2="http://schemas.microsoft.com/office/drawing/2015/10/21/chartex" xmlns:cx3="http://schemas.microsoft.com/office/drawing/2016/5/9/chartex" xmlns:cx4="http://schemas.microsoft.com/office/drawing/2016/5/10/chartex" xmlns:cx5="http://schemas.microsoft.com/office/drawing/2016/5/11/chartex" xmlns:cx6="http://schemas.microsoft.com/office/drawing/2016/5/12/chartex" xmlns:cx7="http://schemas.microsoft.com/office/drawing/2016/5/13/chartex" xmlns:cx8="http://schemas.microsoft.com/office/drawing/2016/5/14/chartex" xmlns:mc="http://schemas.openxmlformats.org/markup-compatibility/2006" xmlns:aink="http://schemas.microsoft.com/office/drawing/2016/ink" xmlns:am3d="http://schemas.microsoft.com/office/drawing/2017/model3d" xmlns:o="urn:schemas-microsoft-com:office:office" xmlns:r="http://schemas.openxmlformats.org/officeDocument/2006/relationships" xmlns:m="http://schemas.openxmlformats.org/officeDocument/2006/math" xmlns:v="urn:schemas-microsoft-com:vml" xmlns:wp14="http://schemas.microsoft.com/office/word/2010/wordprocessingDrawing" xmlns:wp="http://schemas.openxmlformats.org/drawingml/2006/wordprocessingDrawing" xmlns:w10="urn:schemas-microsoft-com:office:word" xmlns:w="http://schemas.openxmlformats.org/wordprocessingml/2006/main" xmlns:w14="http://schemas.microsoft.com/office/word/2010/wordml" xmlns:w15="http://schemas.microsoft.com/office/word/2012/wordml" xmlns:w16cex="http://schemas.microsoft.com/office/word/2018/wordml/cex" xmlns:w16cid="http://schemas.microsoft.com/office/word/2016/wordml/cid" xmlns:w16="http://schemas.microsoft.com/office/word/2018/wordml" xmlns:w16sdtdh="http://schemas.microsoft.com/office/word/2020/wordml/sdtdatahash" xmlns:w16se="http://schemas.microsoft.com/office/word/2015/wordml/symex" xmlns:wpg="http://schemas.microsoft.com/office/word/2010/wordprocessingGroup" xmlns:wpi="http://schemas.microsoft.com/office/word/2010/wordprocessingInk" xmlns:wne="http://schemas.microsoft.com/office/word/2006/wordml" xmlns:wps="http://schemas.microsoft.com/office/word/2010/wordprocessingShape" mc:Ignorable="w14 w15 w16se w16cid w16 w16cex w16sdtdh wp14">
   <w:body>
     <w:p>
       <w:pPr>
         <w:pStyle w:val="Heading1"/>
         <w:rPr>
+          <w:rFonts w:hint="default"/>
           <w:b w:val="0"/>
           <w:sz w:val="24"/>
           <w:szCs w:val="24"/>
@@ -80,6 +81,13 @@
           <w:szCs w:val="24"/>
         </w:rPr>
         <w:br/>
+      </w:r>
+      <w:r>
+        <w:rPr>
+          <w:sz w:val="24"/>
+          <w:szCs w:val="24"/>
+          <w:highlight w:val="yellow"/>
+        </w:rPr>
         <w:t>B. Considering the eternal impact of daily choices</w:t>
       </w:r>
       <w:r>
@@ -147,6 +155,13 @@
           <w:szCs w:val="24"/>
         </w:rPr>
         <w:br/>
+      </w:r>
+      <w:r>
+        <w:rPr>
+          <w:sz w:val="24"/>
+          <w:szCs w:val="24"/>
+          <w:highlight w:val="yellow"/>
+        </w:rPr>
         <w:t>A. Colossians 3:1–2</w:t>
       </w:r>
       <w:r>
@@ -273,6 +288,13 @@
           <w:szCs w:val="24"/>
         </w:rPr>
         <w:br/>
+      </w:r>
+      <w:r>
+        <w:rPr>
+          <w:sz w:val="24"/>
+          <w:szCs w:val="24"/>
+          <w:highlight w:val="yellow"/>
+        </w:rPr>
         <w:t>B. Living according to God’s plan</w:t>
       </w:r>
       <w:r>
@@ -340,6 +362,13 @@
           <w:szCs w:val="24"/>
         </w:rPr>
         <w:br/>
+      </w:r>
+      <w:r>
+        <w:rPr>
+          <w:sz w:val="24"/>
+          <w:szCs w:val="24"/>
+          <w:highlight w:val="yellow"/>
+        </w:rPr>
         <w:t>A. Measuring decisions by eternal significance</w:t>
       </w:r>
       <w:r>
@@ -431,6 +460,13 @@
           <w:szCs w:val="24"/>
         </w:rPr>
         <w:br/>
+      </w:r>
+      <w:r>
+        <w:rPr>
+          <w:sz w:val="24"/>
+          <w:szCs w:val="24"/>
+          <w:highlight w:val="yellow"/>
+        </w:rPr>
         <w:t>C. Material wealth above all</w:t>
       </w:r>
       <w:r>
@@ -533,6 +569,13 @@
           <w:szCs w:val="24"/>
         </w:rPr>
         <w:br/>
+      </w:r>
+      <w:r>
+        <w:rPr>
+          <w:sz w:val="24"/>
+          <w:szCs w:val="24"/>
+          <w:highlight w:val="yellow"/>
+        </w:rPr>
         <w:t>A. Matthew 6:21</w:t>
       </w:r>
       <w:r>
@@ -617,6 +660,13 @@
           <w:szCs w:val="24"/>
         </w:rPr>
         <w:br/>
+      </w:r>
+      <w:r>
+        <w:rPr>
+          <w:sz w:val="24"/>
+          <w:szCs w:val="24"/>
+          <w:highlight w:val="yellow"/>
+        </w:rPr>
         <w:t>B. Reflecting daily on life choices in light of eternity</w:t>
       </w:r>
       <w:r>
@@ -768,6 +818,13 @@
           <w:szCs w:val="24"/>
         </w:rPr>
         <w:br/>
+      </w:r>
+      <w:r>
+        <w:rPr>
+          <w:sz w:val="24"/>
+          <w:szCs w:val="24"/>
+          <w:highlight w:val="yellow"/>
+        </w:rPr>
         <w:t>A. Ephesians 6:10–18</w:t>
       </w:r>
       <w:r>
@@ -894,6 +951,13 @@
           <w:szCs w:val="24"/>
         </w:rPr>
         <w:br/>
+      </w:r>
+      <w:r>
+        <w:rPr>
+          <w:sz w:val="24"/>
+          <w:szCs w:val="24"/>
+          <w:highlight w:val="yellow"/>
+        </w:rPr>
         <w:t>B. Faith and reliance on God</w:t>
       </w:r>
       <w:r>
@@ -961,6 +1025,13 @@
           <w:szCs w:val="24"/>
         </w:rPr>
         <w:br/>
+      </w:r>
+      <w:r>
+        <w:rPr>
+          <w:sz w:val="24"/>
+          <w:szCs w:val="24"/>
+          <w:highlight w:val="yellow"/>
+        </w:rPr>
         <w:t>A. 1 Peter 5:8</w:t>
       </w:r>
       <w:r>
@@ -1076,6 +1147,13 @@
           <w:szCs w:val="24"/>
         </w:rPr>
         <w:br/>
+      </w:r>
+      <w:r>
+        <w:rPr>
+          <w:sz w:val="24"/>
+          <w:szCs w:val="24"/>
+          <w:highlight w:val="yellow"/>
+        </w:rPr>
         <w:t>D. Crown of success</w:t>
       </w:r>
       <w:r>
@@ -1170,6 +1248,13 @@
           <w:szCs w:val="24"/>
         </w:rPr>
         <w:br/>
+      </w:r>
+      <w:r>
+        <w:rPr>
+          <w:sz w:val="24"/>
+          <w:szCs w:val="24"/>
+          <w:highlight w:val="yellow"/>
+        </w:rPr>
         <w:t>A. James 4:7</w:t>
       </w:r>
       <w:r>
@@ -1254,6 +1339,13 @@
           <w:szCs w:val="24"/>
         </w:rPr>
         <w:br/>
+      </w:r>
+      <w:r>
+        <w:rPr>
+          <w:sz w:val="24"/>
+          <w:szCs w:val="24"/>
+          <w:highlight w:val="yellow"/>
+        </w:rPr>
         <w:t>B. Eternal reward and spiritual growth</w:t>
       </w:r>
       <w:r>
@@ -1321,6 +1413,13 @@
           <w:szCs w:val="24"/>
         </w:rPr>
         <w:br/>
+      </w:r>
+      <w:r>
+        <w:rPr>
+          <w:sz w:val="24"/>
+          <w:szCs w:val="24"/>
+          <w:highlight w:val="yellow"/>
+        </w:rPr>
         <w:t>A. Awareness of spiritual attacks</w:t>
       </w:r>
       <w:r>
@@ -1472,6 +1571,13 @@
           <w:szCs w:val="24"/>
         </w:rPr>
         <w:br/>
+      </w:r>
+      <w:r>
+        <w:rPr>
+          <w:sz w:val="24"/>
+          <w:szCs w:val="24"/>
+          <w:highlight w:val="yellow"/>
+        </w:rPr>
         <w:t>B. Pray with thanksgiving and experience God’s peace</w:t>
       </w:r>
       <w:r>
@@ -1548,6 +1654,13 @@
           <w:szCs w:val="24"/>
         </w:rPr>
         <w:br/>
+      </w:r>
+      <w:r>
+        <w:rPr>
+          <w:sz w:val="24"/>
+          <w:szCs w:val="24"/>
+          <w:highlight w:val="yellow"/>
+        </w:rPr>
         <w:t>B. A natural emotion that can be managed through faith</w:t>
       </w:r>
       <w:r>
@@ -1659,6 +1772,13 @@
           <w:szCs w:val="24"/>
         </w:rPr>
         <w:br/>
+      </w:r>
+      <w:r>
+        <w:rPr>
+          <w:sz w:val="24"/>
+          <w:szCs w:val="24"/>
+          <w:highlight w:val="yellow"/>
+        </w:rPr>
         <w:t>A. 2 Timothy 1:7</w:t>
       </w:r>
       <w:r>
@@ -1758,6 +1878,13 @@
           <w:szCs w:val="24"/>
         </w:rPr>
         <w:br/>
+      </w:r>
+      <w:r>
+        <w:rPr>
+          <w:sz w:val="24"/>
+          <w:szCs w:val="24"/>
+          <w:highlight w:val="yellow"/>
+        </w:rPr>
         <w:t>D. Ignoring problems</w:t>
       </w:r>
       <w:r>
@@ -1878,6 +2005,13 @@
           <w:szCs w:val="24"/>
         </w:rPr>
         <w:br/>
+      </w:r>
+      <w:r>
+        <w:rPr>
+          <w:sz w:val="24"/>
+          <w:szCs w:val="24"/>
+          <w:highlight w:val="yellow"/>
+        </w:rPr>
         <w:t>D. All of the above</w:t>
       </w:r>
       <w:r>
@@ -1938,6 +2072,13 @@
           <w:szCs w:val="24"/>
         </w:rPr>
         <w:br/>
+      </w:r>
+      <w:r>
+        <w:rPr>
+          <w:sz w:val="24"/>
+          <w:szCs w:val="24"/>
+          <w:highlight w:val="yellow"/>
+        </w:rPr>
         <w:t>B. Strengthens courage and faith</w:t>
       </w:r>
       <w:r>
@@ -2013,6 +2154,13 @@
           <w:szCs w:val="24"/>
         </w:rPr>
         <w:br/>
+      </w:r>
+      <w:r>
+        <w:rPr>
+          <w:sz w:val="24"/>
+          <w:szCs w:val="24"/>
+          <w:highlight w:val="yellow"/>
+        </w:rPr>
         <w:t>B. Psalm 23:1</w:t>
       </w:r>
       <w:r>
@@ -2148,6 +2296,13 @@
           <w:szCs w:val="24"/>
         </w:rPr>
         <w:br/>
+      </w:r>
+      <w:r>
+        <w:rPr>
+          <w:sz w:val="24"/>
+          <w:szCs w:val="24"/>
+          <w:highlight w:val="yellow"/>
+        </w:rPr>
         <w:t>A. Romans 12:2</w:t>
       </w:r>
       <w:r>
@@ -2275,6 +2430,13 @@
           <w:szCs w:val="24"/>
         </w:rPr>
         <w:br/>
+      </w:r>
+      <w:r>
+        <w:rPr>
+          <w:sz w:val="24"/>
+          <w:szCs w:val="24"/>
+          <w:highlight w:val="yellow"/>
+        </w:rPr>
         <w:t>B. Reflecting on God’s Word and promises</w:t>
       </w:r>
       <w:r>
@@ -2351,6 +2513,13 @@
           <w:szCs w:val="24"/>
         </w:rPr>
         <w:br/>
+      </w:r>
+      <w:r>
+        <w:rPr>
+          <w:sz w:val="24"/>
+          <w:szCs w:val="24"/>
+          <w:highlight w:val="yellow"/>
+        </w:rPr>
         <w:t>B. By God’s Word</w:t>
       </w:r>
       <w:r>
@@ -2447,6 +2616,7 @@
         <w:rPr>
           <w:sz w:val="24"/>
           <w:szCs w:val="24"/>
+          <w:highlight w:val="yellow"/>
         </w:rPr>
         <w:lastRenderedPageBreak/>
         <w:t>D. All of the above</w:t>
@@ -2554,6 +2724,13 @@
           <w:szCs w:val="24"/>
         </w:rPr>
         <w:br/>
+      </w:r>
+      <w:r>
+        <w:rPr>
+          <w:sz w:val="24"/>
+          <w:szCs w:val="24"/>
+          <w:highlight w:val="yellow"/>
+        </w:rPr>
         <w:t>B. Essential for mental and spiritual growth</w:t>
       </w:r>
       <w:r>
@@ -2622,6 +2799,13 @@
           <w:szCs w:val="24"/>
         </w:rPr>
         <w:br/>
+      </w:r>
+      <w:r>
+        <w:rPr>
+          <w:sz w:val="24"/>
+          <w:szCs w:val="24"/>
+          <w:highlight w:val="yellow"/>
+        </w:rPr>
         <w:t>A. Whatever is true, noble, right, pure, lovely, admirable</w:t>
       </w:r>
       <w:r>
@@ -2705,6 +2889,13 @@
           <w:szCs w:val="24"/>
         </w:rPr>
         <w:br/>
+      </w:r>
+      <w:r>
+        <w:rPr>
+          <w:sz w:val="24"/>
+          <w:szCs w:val="24"/>
+          <w:highlight w:val="yellow"/>
+        </w:rPr>
         <w:t>B. Process and align emotions with God’s Word</w:t>
       </w:r>
       <w:r>
@@ -2842,6 +3033,13 @@
           <w:szCs w:val="24"/>
         </w:rPr>
         <w:br/>
+      </w:r>
+      <w:r>
+        <w:rPr>
+          <w:sz w:val="24"/>
+          <w:szCs w:val="24"/>
+          <w:highlight w:val="yellow"/>
+        </w:rPr>
         <w:t>A. 1 Corinthians 6:19–20</w:t>
       </w:r>
       <w:r>
@@ -2968,6 +3166,13 @@
           <w:szCs w:val="24"/>
         </w:rPr>
         <w:br/>
+      </w:r>
+      <w:r>
+        <w:rPr>
+          <w:sz w:val="24"/>
+          <w:szCs w:val="24"/>
+          <w:highlight w:val="yellow"/>
+        </w:rPr>
         <w:t>B. Burnout</w:t>
       </w:r>
       <w:r>
@@ -3043,6 +3248,13 @@
           <w:szCs w:val="24"/>
         </w:rPr>
         <w:br/>
+      </w:r>
+      <w:r>
+        <w:rPr>
+          <w:sz w:val="24"/>
+          <w:szCs w:val="24"/>
+          <w:highlight w:val="yellow"/>
+        </w:rPr>
         <w:t>B. To take time apart for rest</w:t>
       </w:r>
       <w:r>
@@ -3128,6 +3340,13 @@
           <w:szCs w:val="24"/>
         </w:rPr>
         <w:br/>
+      </w:r>
+      <w:r>
+        <w:rPr>
+          <w:sz w:val="24"/>
+          <w:szCs w:val="24"/>
+          <w:highlight w:val="yellow"/>
+        </w:rPr>
         <w:t>A. Protecting the body</w:t>
       </w:r>
       <w:r>
@@ -3246,6 +3465,13 @@
           <w:szCs w:val="24"/>
         </w:rPr>
         <w:br/>
+      </w:r>
+      <w:r>
+        <w:rPr>
+          <w:sz w:val="24"/>
+          <w:szCs w:val="24"/>
+          <w:highlight w:val="yellow"/>
+        </w:rPr>
         <w:t>A. Sleep, Sabbath, and mental breaks</w:t>
       </w:r>
       <w:r>
@@ -3321,6 +3547,13 @@
           <w:szCs w:val="24"/>
         </w:rPr>
         <w:br/>
+      </w:r>
+      <w:r>
+        <w:rPr>
+          <w:sz w:val="24"/>
+          <w:szCs w:val="24"/>
+          <w:highlight w:val="yellow"/>
+        </w:rPr>
         <w:t>A. Spiritual, mental, and physical health</w:t>
       </w:r>
       <w:r>
@@ -3447,6 +3680,13 @@
           <w:szCs w:val="24"/>
         </w:rPr>
         <w:br/>
+      </w:r>
+      <w:r>
+        <w:rPr>
+          <w:sz w:val="24"/>
+          <w:szCs w:val="24"/>
+          <w:highlight w:val="yellow"/>
+        </w:rPr>
         <w:t>B. Neglecting God’s temple</w:t>
       </w:r>
       <w:r>
@@ -3590,6 +3830,13 @@
           <w:szCs w:val="24"/>
         </w:rPr>
         <w:br/>
+      </w:r>
+      <w:r>
+        <w:rPr>
+          <w:sz w:val="24"/>
+          <w:szCs w:val="24"/>
+          <w:highlight w:val="yellow"/>
+        </w:rPr>
         <w:t>B. Our refuge and strength</w:t>
       </w:r>
       <w:r>
@@ -3665,6 +3912,13 @@
           <w:szCs w:val="24"/>
         </w:rPr>
         <w:br/>
+      </w:r>
+      <w:r>
+        <w:rPr>
+          <w:sz w:val="24"/>
+          <w:szCs w:val="24"/>
+          <w:highlight w:val="yellow"/>
+        </w:rPr>
         <w:t>B. God works all things together for good</w:t>
       </w:r>
       <w:r>
@@ -3745,6 +3999,7 @@
         <w:rPr>
           <w:sz w:val="24"/>
           <w:szCs w:val="24"/>
+          <w:highlight w:val="yellow"/>
         </w:rPr>
         <w:lastRenderedPageBreak/>
         <w:t>B. Trust in God’s plan</w:t>
@@ -3865,6 +4120,13 @@
           <w:szCs w:val="24"/>
         </w:rPr>
         <w:br/>
+      </w:r>
+      <w:r>
+        <w:rPr>
+          <w:sz w:val="24"/>
+          <w:szCs w:val="24"/>
+          <w:highlight w:val="yellow"/>
+        </w:rPr>
         <w:t>B. Turning to God in prayer and Scripture</w:t>
       </w:r>
       <w:r>
@@ -3932,6 +4194,13 @@
           <w:szCs w:val="24"/>
         </w:rPr>
         <w:br/>
+      </w:r>
+      <w:r>
+        <w:rPr>
+          <w:sz w:val="24"/>
+          <w:szCs w:val="24"/>
+          <w:highlight w:val="yellow"/>
+        </w:rPr>
         <w:t>A. Grow spiritually</w:t>
       </w:r>
       <w:r>
@@ -4058,6 +4327,13 @@
           <w:szCs w:val="24"/>
         </w:rPr>
         <w:br/>
+      </w:r>
+      <w:r>
+        <w:rPr>
+          <w:sz w:val="24"/>
+          <w:szCs w:val="24"/>
+          <w:highlight w:val="yellow"/>
+        </w:rPr>
         <w:t>B. Biblical expression of loss</w:t>
       </w:r>
       <w:r>
@@ -4125,6 +4401,13 @@
           <w:szCs w:val="24"/>
         </w:rPr>
         <w:br/>
+      </w:r>
+      <w:r>
+        <w:rPr>
+          <w:sz w:val="24"/>
+          <w:szCs w:val="24"/>
+          <w:highlight w:val="yellow"/>
+        </w:rPr>
         <w:t>A. Patience, trust, and reliance on God</w:t>
       </w:r>
       <w:r>
@@ -4276,6 +4559,13 @@
           <w:szCs w:val="24"/>
         </w:rPr>
         <w:br/>
+      </w:r>
+      <w:r>
+        <w:rPr>
+          <w:sz w:val="24"/>
+          <w:szCs w:val="24"/>
+          <w:highlight w:val="yellow"/>
+        </w:rPr>
         <w:t>B. Rejoicing always, praying continually, giving thanks</w:t>
       </w:r>
       <w:r>
@@ -4349,6 +4639,11 @@
       </w:r>
       <w:r>
         <w:br/>
+      </w:r>
+      <w:r>
+        <w:rPr>
+          <w:highlight w:val="yellow"/>
+        </w:rPr>
         <w:t>B. A fruit of the Spirit</w:t>
       </w:r>
       <w:r>
@@ -4406,6 +4701,13 @@
           <w:szCs w:val="24"/>
         </w:rPr>
         <w:br/>
+      </w:r>
+      <w:r>
+        <w:rPr>
+          <w:sz w:val="24"/>
+          <w:szCs w:val="24"/>
+          <w:highlight w:val="yellow"/>
+        </w:rPr>
         <w:t>B. Even in difficult situations</w:t>
       </w:r>
       <w:r>
@@ -4516,6 +4818,13 @@
           <w:szCs w:val="24"/>
         </w:rPr>
         <w:br/>
+      </w:r>
+      <w:r>
+        <w:rPr>
+          <w:sz w:val="24"/>
+          <w:szCs w:val="24"/>
+          <w:highlight w:val="yellow"/>
+        </w:rPr>
         <w:t>A. Complaining less and acknowledging blessings</w:t>
       </w:r>
       <w:r>
@@ -4634,6 +4943,13 @@
           <w:szCs w:val="24"/>
         </w:rPr>
         <w:br/>
+      </w:r>
+      <w:r>
+        <w:rPr>
+          <w:sz w:val="24"/>
+          <w:szCs w:val="24"/>
+          <w:highlight w:val="yellow"/>
+        </w:rPr>
         <w:t>A. Daily thanksgiving journal</w:t>
       </w:r>
       <w:r>
@@ -4760,6 +5076,13 @@
           <w:szCs w:val="24"/>
         </w:rPr>
         <w:br/>
+      </w:r>
+      <w:r>
+        <w:rPr>
+          <w:sz w:val="24"/>
+          <w:szCs w:val="24"/>
+          <w:highlight w:val="yellow"/>
+        </w:rPr>
         <w:t>B. Strengthened faith and positive outlook</w:t>
       </w:r>
       <w:r>
@@ -4810,8 +5133,6 @@
           <w:szCs w:val="24"/>
         </w:rPr>
       </w:pPr>
-      <w:bookmarkStart w:id="6" w:name="_GoBack"/>
-      <w:bookmarkEnd w:id="6"/>
     </w:p>
     <w:p>
       <w:pPr>
@@ -4907,6 +5228,13 @@
           <w:szCs w:val="24"/>
         </w:rPr>
         <w:br/>
+      </w:r>
+      <w:r>
+        <w:rPr>
+          <w:sz w:val="24"/>
+          <w:szCs w:val="24"/>
+          <w:highlight w:val="yellow"/>
+        </w:rPr>
         <w:t>A. Guarding the heart</w:t>
       </w:r>
       <w:r>
@@ -4989,6 +5317,13 @@
           <w:szCs w:val="24"/>
         </w:rPr>
         <w:br/>
+      </w:r>
+      <w:r>
+        <w:rPr>
+          <w:sz w:val="24"/>
+          <w:szCs w:val="24"/>
+          <w:highlight w:val="yellow"/>
+        </w:rPr>
         <w:t>A. Walk carefully, making the best use of time</w:t>
       </w:r>
       <w:r>
@@ -5107,6 +5442,13 @@
           <w:szCs w:val="24"/>
         </w:rPr>
         <w:br/>
+      </w:r>
+      <w:r>
+        <w:rPr>
+          <w:sz w:val="24"/>
+          <w:szCs w:val="24"/>
+          <w:highlight w:val="yellow"/>
+        </w:rPr>
         <w:t>A. Using devices purposefully for study or ministry</w:t>
       </w:r>
       <w:r>
@@ -5249,6 +5591,13 @@
           <w:szCs w:val="24"/>
         </w:rPr>
         <w:br/>
+      </w:r>
+      <w:r>
+        <w:rPr>
+          <w:sz w:val="24"/>
+          <w:szCs w:val="24"/>
+          <w:highlight w:val="yellow"/>
+        </w:rPr>
         <w:t>D. All of the above</w:t>
       </w:r>
       <w:r>
@@ -5308,6 +5657,13 @@
           <w:szCs w:val="24"/>
         </w:rPr>
         <w:br/>
+      </w:r>
+      <w:r>
+        <w:rPr>
+          <w:sz w:val="24"/>
+          <w:szCs w:val="24"/>
+          <w:highlight w:val="yellow"/>
+        </w:rPr>
         <w:t>B. Mindfully, with moderation</w:t>
       </w:r>
       <w:r>
@@ -5418,6 +5774,13 @@
           <w:szCs w:val="24"/>
         </w:rPr>
         <w:br/>
+      </w:r>
+      <w:r>
+        <w:rPr>
+          <w:sz w:val="24"/>
+          <w:szCs w:val="24"/>
+          <w:highlight w:val="yellow"/>
+        </w:rPr>
         <w:t>A. Allocating time for spiritual activities</w:t>
       </w:r>
       <w:r>
@@ -5579,6 +5942,13 @@
           <w:szCs w:val="24"/>
         </w:rPr>
         <w:br/>
+      </w:r>
+      <w:r>
+        <w:rPr>
+          <w:sz w:val="24"/>
+          <w:szCs w:val="24"/>
+          <w:highlight w:val="yellow"/>
+        </w:rPr>
         <w:t>B. Dead</w:t>
       </w:r>
       <w:r>
@@ -5654,6 +6024,13 @@
           <w:szCs w:val="24"/>
         </w:rPr>
         <w:br/>
+      </w:r>
+      <w:r>
+        <w:rPr>
+          <w:sz w:val="24"/>
+          <w:szCs w:val="24"/>
+          <w:highlight w:val="yellow"/>
+        </w:rPr>
         <w:t>B. Let their light shine before men</w:t>
       </w:r>
       <w:r>
@@ -5764,6 +6141,13 @@
           <w:szCs w:val="24"/>
         </w:rPr>
         <w:br/>
+      </w:r>
+      <w:r>
+        <w:rPr>
+          <w:sz w:val="24"/>
+          <w:szCs w:val="24"/>
+          <w:highlight w:val="yellow"/>
+        </w:rPr>
         <w:t>A. Love</w:t>
       </w:r>
       <w:r>
@@ -5847,6 +6231,13 @@
           <w:szCs w:val="24"/>
         </w:rPr>
         <w:br/>
+      </w:r>
+      <w:r>
+        <w:rPr>
+          <w:sz w:val="24"/>
+          <w:szCs w:val="24"/>
+          <w:highlight w:val="yellow"/>
+        </w:rPr>
         <w:t>B. Spiritual growth and character</w:t>
       </w:r>
       <w:r>
@@ -5981,6 +6372,13 @@
           <w:szCs w:val="24"/>
         </w:rPr>
         <w:br/>
+      </w:r>
+      <w:r>
+        <w:rPr>
+          <w:sz w:val="24"/>
+          <w:szCs w:val="24"/>
+          <w:highlight w:val="yellow"/>
+        </w:rPr>
         <w:t>D. All of the above</w:t>
       </w:r>
       <w:r>
@@ -6075,6 +6473,13 @@
           <w:szCs w:val="24"/>
         </w:rPr>
         <w:br/>
+      </w:r>
+      <w:r>
+        <w:rPr>
+          <w:sz w:val="24"/>
+          <w:szCs w:val="24"/>
+          <w:highlight w:val="yellow"/>
+        </w:rPr>
         <w:t>A. Identifying your gifts and opportunities</w:t>
       </w:r>
       <w:r>
@@ -6256,6 +6661,13 @@
           <w:szCs w:val="24"/>
         </w:rPr>
         <w:br/>
+      </w:r>
+      <w:r>
+        <w:rPr>
+          <w:sz w:val="24"/>
+          <w:szCs w:val="24"/>
+          <w:highlight w:val="yellow"/>
+        </w:rPr>
         <w:t>A. Spiritual disciplines, obedience, priorities</w:t>
       </w:r>
       <w:r>
@@ -6331,6 +6743,13 @@
           <w:szCs w:val="24"/>
         </w:rPr>
         <w:br/>
+      </w:r>
+      <w:r>
+        <w:rPr>
+          <w:sz w:val="24"/>
+          <w:szCs w:val="24"/>
+          <w:highlight w:val="yellow"/>
+        </w:rPr>
         <w:t>A. Death precedes judgment</w:t>
       </w:r>
       <w:r>
@@ -6449,6 +6868,13 @@
           <w:szCs w:val="24"/>
         </w:rPr>
         <w:br/>
+      </w:r>
+      <w:r>
+        <w:rPr>
+          <w:sz w:val="24"/>
+          <w:szCs w:val="24"/>
+          <w:highlight w:val="yellow"/>
+        </w:rPr>
         <w:t>A. Assessing spiritual growth</w:t>
       </w:r>
       <w:r>
@@ -6457,6 +6883,12 @@
           <w:szCs w:val="24"/>
         </w:rPr>
         <w:br/>
+      </w:r>
+      <w:r>
+        <w:rPr>
+          <w:sz w:val="24"/>
+          <w:szCs w:val="24"/>
+        </w:rPr>
         <w:t>B. Ignoring God</w:t>
       </w:r>
       <w:r>
@@ -6524,6 +6956,13 @@
           <w:szCs w:val="24"/>
         </w:rPr>
         <w:br/>
+      </w:r>
+      <w:r>
+        <w:rPr>
+          <w:sz w:val="24"/>
+          <w:szCs w:val="24"/>
+          <w:highlight w:val="yellow"/>
+        </w:rPr>
         <w:t>A. Salvation through faith in Christ</w:t>
       </w:r>
       <w:r>
@@ -6642,6 +7081,13 @@
           <w:szCs w:val="24"/>
         </w:rPr>
         <w:br/>
+      </w:r>
+      <w:r>
+        <w:rPr>
+          <w:sz w:val="24"/>
+          <w:szCs w:val="24"/>
+          <w:highlight w:val="yellow"/>
+        </w:rPr>
         <w:t>A. Obedience, holiness, and faith</w:t>
       </w:r>
       <w:r>
@@ -6760,6 +7206,13 @@
           <w:szCs w:val="24"/>
         </w:rPr>
         <w:br/>
+      </w:r>
+      <w:r>
+        <w:rPr>
+          <w:sz w:val="24"/>
+          <w:szCs w:val="24"/>
+          <w:highlight w:val="yellow"/>
+        </w:rPr>
         <w:t>A. Eternal life with God</w:t>
       </w:r>
       <w:r>
@@ -6820,7 +7273,7 @@
 </file>
 
 <file path=word/numbering.xml><?xml version="1.0" encoding="utf-8"?>
-<w:numbering xmlns:wpc="http://schemas.microsoft.com/office/word/2010/wordprocessingCanvas" xmlns:cx="http://schemas.microsoft.com/office/drawing/2014/chartex" xmlns:cx1="http://schemas.microsoft.com/office/drawing/2015/9/8/chartex" xmlns:cx2="http://schemas.microsoft.com/office/drawing/2015/10/21/chartex" xmlns:cx3="http://schemas.microsoft.com/office/drawing/2016/5/9/chartex" xmlns:cx4="http://schemas.microsoft.com/office/drawing/2016/5/10/chartex" xmlns:cx5="http://schemas.microsoft.com/office/drawing/2016/5/11/chartex" xmlns:cx6="http://schemas.microsoft.com/office/drawing/2016/5/12/chartex" xmlns:cx7="http://schemas.microsoft.com/office/drawing/2016/5/13/chartex" xmlns:cx8="http://schemas.microsoft.com/office/drawing/2016/5/14/chartex" xmlns:mc="http://schemas.openxmlformats.org/markup-compatibility/2006" xmlns:aink="http://schemas.microsoft.com/office/drawing/2016/ink" xmlns:am3d="http://schemas.microsoft.com/office/drawing/2017/model3d" xmlns:o="urn:schemas-microsoft-com:office:office" xmlns:r="http://schemas.openxmlformats.org/officeDocument/2006/relationships" xmlns:m="http://schemas.openxmlformats.org/officeDocument/2006/math" xmlns:v="urn:schemas-microsoft-com:vml" xmlns:wp14="http://schemas.microsoft.com/office/word/2010/wordprocessingDrawing" xmlns:wp="http://schemas.openxmlformats.org/drawingml/2006/wordprocessingDrawing" xmlns:w10="urn:schemas-microsoft-com:office:word" xmlns:w="http://schemas.openxmlformats.org/wordprocessingml/2006/main" xmlns:w14="http://schemas.microsoft.com/office/word/2010/wordml" xmlns:w15="http://schemas.microsoft.com/office/word/2012/wordml" xmlns:w16cid="http://schemas.microsoft.com/office/word/2016/wordml/cid" xmlns:w16se="http://schemas.microsoft.com/office/word/2015/wordml/symex" xmlns:wpg="http://schemas.microsoft.com/office/word/2010/wordprocessingGroup" xmlns:wpi="http://schemas.microsoft.com/office/word/2010/wordprocessingInk" xmlns:wne="http://schemas.microsoft.com/office/word/2006/wordml" xmlns:wps="http://schemas.microsoft.com/office/word/2010/wordprocessingShape" mc:Ignorable="w14 w15 w16se w16cid wp14">
+<w:numbering xmlns:wpc="http://schemas.microsoft.com/office/word/2010/wordprocessingCanvas" xmlns:cx="http://schemas.microsoft.com/office/drawing/2014/chartex" xmlns:cx1="http://schemas.microsoft.com/office/drawing/2015/9/8/chartex" xmlns:cx2="http://schemas.microsoft.com/office/drawing/2015/10/21/chartex" xmlns:cx3="http://schemas.microsoft.com/office/drawing/2016/5/9/chartex" xmlns:cx4="http://schemas.microsoft.com/office/drawing/2016/5/10/chartex" xmlns:cx5="http://schemas.microsoft.com/office/drawing/2016/5/11/chartex" xmlns:cx6="http://schemas.microsoft.com/office/drawing/2016/5/12/chartex" xmlns:cx7="http://schemas.microsoft.com/office/drawing/2016/5/13/chartex" xmlns:cx8="http://schemas.microsoft.com/office/drawing/2016/5/14/chartex" xmlns:mc="http://schemas.openxmlformats.org/markup-compatibility/2006" xmlns:aink="http://schemas.microsoft.com/office/drawing/2016/ink" xmlns:am3d="http://schemas.microsoft.com/office/drawing/2017/model3d" xmlns:o="urn:schemas-microsoft-com:office:office" xmlns:r="http://schemas.openxmlformats.org/officeDocument/2006/relationships" xmlns:m="http://schemas.openxmlformats.org/officeDocument/2006/math" xmlns:v="urn:schemas-microsoft-com:vml" xmlns:wp14="http://schemas.microsoft.com/office/word/2010/wordprocessingDrawing" xmlns:wp="http://schemas.openxmlformats.org/drawingml/2006/wordprocessingDrawing" xmlns:w10="urn:schemas-microsoft-com:office:word" xmlns:w="http://schemas.openxmlformats.org/wordprocessingml/2006/main" xmlns:w14="http://schemas.microsoft.com/office/word/2010/wordml" xmlns:w15="http://schemas.microsoft.com/office/word/2012/wordml" xmlns:w16cex="http://schemas.microsoft.com/office/word/2018/wordml/cex" xmlns:w16cid="http://schemas.microsoft.com/office/word/2016/wordml/cid" xmlns:w16="http://schemas.microsoft.com/office/word/2018/wordml" xmlns:w16sdtdh="http://schemas.microsoft.com/office/word/2020/wordml/sdtdatahash" xmlns:w16se="http://schemas.microsoft.com/office/word/2015/wordml/symex" xmlns:wpg="http://schemas.microsoft.com/office/word/2010/wordprocessingGroup" xmlns:wpi="http://schemas.microsoft.com/office/word/2010/wordprocessingInk" xmlns:wne="http://schemas.microsoft.com/office/word/2006/wordml" xmlns:wps="http://schemas.microsoft.com/office/word/2010/wordprocessingShape" mc:Ignorable="w14 w15 w16se w16cid w16 w16cex w16sdtdh wp14">
   <w:abstractNum w:abstractNumId="0" w15:restartNumberingAfterBreak="0">
     <w:nsid w:val="9CEBE4C0"/>
     <w:multiLevelType w:val="multilevel"/>
@@ -8345,7 +8798,7 @@
 </file>
 
 <file path=word/styles.xml><?xml version="1.0" encoding="utf-8"?>
-<w:styles xmlns:mc="http://schemas.openxmlformats.org/markup-compatibility/2006" xmlns:r="http://schemas.openxmlformats.org/officeDocument/2006/relationships" xmlns:w="http://schemas.openxmlformats.org/wordprocessingml/2006/main" xmlns:w14="http://schemas.microsoft.com/office/word/2010/wordml" xmlns:w15="http://schemas.microsoft.com/office/word/2012/wordml" xmlns:w16cid="http://schemas.microsoft.com/office/word/2016/wordml/cid" xmlns:w16se="http://schemas.microsoft.com/office/word/2015/wordml/symex" mc:Ignorable="w14 w15 w16se w16cid">
+<w:styles xmlns:mc="http://schemas.openxmlformats.org/markup-compatibility/2006" xmlns:r="http://schemas.openxmlformats.org/officeDocument/2006/relationships" xmlns:w="http://schemas.openxmlformats.org/wordprocessingml/2006/main" xmlns:w14="http://schemas.microsoft.com/office/word/2010/wordml" xmlns:w15="http://schemas.microsoft.com/office/word/2012/wordml" xmlns:w16cex="http://schemas.microsoft.com/office/word/2018/wordml/cex" xmlns:w16cid="http://schemas.microsoft.com/office/word/2016/wordml/cid" xmlns:w16="http://schemas.microsoft.com/office/word/2018/wordml" xmlns:w16sdtdh="http://schemas.microsoft.com/office/word/2020/wordml/sdtdatahash" xmlns:w16se="http://schemas.microsoft.com/office/word/2015/wordml/symex" mc:Ignorable="w14 w15 w16se w16cid w16 w16cex w16sdtdh">
   <w:docDefaults>
     <w:rPrDefault>
       <w:rPr>
@@ -8361,7 +8814,7 @@
       </w:pPr>
     </w:pPrDefault>
   </w:docDefaults>
-  <w:latentStyles w:defLockedState="0" w:defUIPriority="99" w:defSemiHidden="0" w:defUnhideWhenUsed="0" w:defQFormat="0" w:count="375">
+  <w:latentStyles w:defLockedState="0" w:defUIPriority="99" w:defSemiHidden="0" w:defUnhideWhenUsed="0" w:defQFormat="0" w:count="376">
     <w:lsdException w:name="Normal" w:uiPriority="0" w:qFormat="1"/>
     <w:lsdException w:name="heading 1" w:uiPriority="0" w:qFormat="1"/>
     <w:lsdException w:name="heading 2" w:semiHidden="1" w:uiPriority="0" w:unhideWhenUsed="1" w:qFormat="1"/>
@@ -8467,7 +8920,6 @@
     <w:lsdException w:name="HTML Sample" w:semiHidden="1" w:unhideWhenUsed="1"/>
     <w:lsdException w:name="HTML Typewriter" w:semiHidden="1" w:unhideWhenUsed="1"/>
     <w:lsdException w:name="HTML Variable" w:semiHidden="1" w:unhideWhenUsed="1"/>
-    <w:lsdException w:name="Normal Table" w:semiHidden="1" w:unhideWhenUsed="1"/>
     <w:lsdException w:name="annotation subject" w:semiHidden="1" w:unhideWhenUsed="1"/>
     <w:lsdException w:name="No List" w:semiHidden="1" w:unhideWhenUsed="1"/>
     <w:lsdException w:name="Outline List 1" w:semiHidden="1" w:unhideWhenUsed="1"/>
@@ -8514,10 +8966,8 @@
     <w:lsdException w:name="Table Subtle 2" w:semiHidden="1" w:unhideWhenUsed="1"/>
     <w:lsdException w:name="Table Web 1" w:semiHidden="1" w:unhideWhenUsed="1"/>
     <w:lsdException w:name="Table Web 2" w:semiHidden="1" w:unhideWhenUsed="1"/>
-    <w:lsdException w:name="Table Web 3" w:semiHidden="1" w:unhideWhenUsed="1"/>
     <w:lsdException w:name="Balloon Text" w:semiHidden="1" w:unhideWhenUsed="1"/>
     <w:lsdException w:name="Table Grid" w:uiPriority="39"/>
-    <w:lsdException w:name="Table Theme" w:semiHidden="1" w:unhideWhenUsed="1"/>
     <w:lsdException w:name="Placeholder Text" w:semiHidden="1"/>
     <w:lsdException w:name="No Spacing" w:uiPriority="1" w:qFormat="1"/>
     <w:lsdException w:name="Light Shading" w:uiPriority="60"/>
@@ -8737,6 +9187,7 @@
     <w:lsdException w:name="Smart Hyperlink" w:semiHidden="1" w:unhideWhenUsed="1"/>
     <w:lsdException w:name="Hashtag" w:semiHidden="1" w:unhideWhenUsed="1"/>
     <w:lsdException w:name="Unresolved Mention" w:semiHidden="1" w:unhideWhenUsed="1"/>
+    <w:lsdException w:name="Smart Link" w:semiHidden="1" w:unhideWhenUsed="1"/>
   </w:latentStyles>
   <w:style w:type="paragraph" w:default="1" w:styleId="Normal">
     <w:name w:val="Normal"/>

</xml_diff>